<commit_message>
feat: se actualizo la documentacion del proyecto
</commit_message>
<xml_diff>
--- a/Documentacion/Tierra de nadie.docx
+++ b/Documentacion/Tierra de nadie.docx
@@ -1767,9 +1767,779 @@
     </w:p>
     <w:p>
       <w:pPr>
+        <w:spacing w:after="0" w:line="279" w:lineRule="auto"/>
+        <w:rPr>
+          <w:rFonts w:ascii="Aptos" w:eastAsia="Aptos" w:hAnsi="Aptos" w:cs="Aptos"/>
+          <w:color w:val="000000" w:themeColor="text1"/>
+        </w:rPr>
+      </w:pPr>
+    </w:p>
+    <w:p>
+      <w:pPr>
+        <w:spacing w:after="0" w:line="279" w:lineRule="auto"/>
+        <w:rPr>
+          <w:rFonts w:ascii="Aptos" w:eastAsia="Aptos" w:hAnsi="Aptos" w:cs="Aptos"/>
+          <w:color w:val="000000" w:themeColor="text1"/>
+        </w:rPr>
+      </w:pPr>
+      <w:r>
+        <w:rPr>
+          <w:rFonts w:ascii="Aptos" w:eastAsia="Aptos" w:hAnsi="Aptos" w:cs="Aptos"/>
+          <w:color w:val="000000" w:themeColor="text1"/>
+        </w:rPr>
+        <w:t>Dado que no</w:t>
+      </w:r>
+      <w:r>
+        <w:rPr>
+          <w:rFonts w:ascii="Aptos" w:eastAsia="Aptos" w:hAnsi="Aptos" w:cs="Aptos"/>
+          <w:color w:val="000000" w:themeColor="text1"/>
+        </w:rPr>
+        <w:t xml:space="preserve"> se recibió respuesta alguna, se procedió a crear un equipo de respuesta </w:t>
+      </w:r>
+      <w:r>
+        <w:rPr>
+          <w:rFonts w:ascii="Aptos" w:eastAsia="Aptos" w:hAnsi="Aptos" w:cs="Aptos"/>
+          <w:color w:val="000000" w:themeColor="text1"/>
+        </w:rPr>
+        <w:t>extraoficial</w:t>
+      </w:r>
+      <w:r>
+        <w:rPr>
+          <w:rFonts w:ascii="Aptos" w:eastAsia="Aptos" w:hAnsi="Aptos" w:cs="Aptos"/>
+          <w:color w:val="000000" w:themeColor="text1"/>
+        </w:rPr>
+        <w:t>, esta operación consiste en ubicar y encontrar al comandante perdido y traerlo a casa</w:t>
+      </w:r>
+      <w:r>
+        <w:rPr>
+          <w:rFonts w:ascii="Aptos" w:eastAsia="Aptos" w:hAnsi="Aptos" w:cs="Aptos"/>
+          <w:color w:val="000000" w:themeColor="text1"/>
+        </w:rPr>
+        <w:t xml:space="preserve">. El equipo consta de 5 integrantes los cuales ya son veteranos experimentados </w:t>
+      </w:r>
+    </w:p>
+    <w:p>
+      <w:pPr>
         <w:jc w:val="both"/>
       </w:pPr>
     </w:p>
+    <w:p>
+      <w:pPr>
+        <w:jc w:val="both"/>
+      </w:pPr>
+      <w:r>
+        <w:t>Integrantes:</w:t>
+      </w:r>
+    </w:p>
+    <w:p>
+      <w:pPr>
+        <w:rPr>
+          <w:b/>
+          <w:bCs/>
+        </w:rPr>
+      </w:pPr>
+      <w:r>
+        <w:rPr>
+          <w:b/>
+          <w:bCs/>
+        </w:rPr>
+        <w:t xml:space="preserve">1. </w:t>
+      </w:r>
+      <w:r>
+        <w:rPr>
+          <w:b/>
+          <w:bCs/>
+        </w:rPr>
+        <w:t>Specter – Líder de equipo (CTO)</w:t>
+      </w:r>
+    </w:p>
+    <w:p>
+      <w:r>
+        <w:rPr>
+          <w:b/>
+          <w:bCs/>
+        </w:rPr>
+        <w:t>Nombre real</w:t>
+      </w:r>
+      <w:r>
+        <w:rPr>
+          <w:b/>
+          <w:bCs/>
+        </w:rPr>
+        <w:t>:</w:t>
+      </w:r>
+      <w:r>
+        <w:rPr>
+          <w:b/>
+          <w:bCs/>
+        </w:rPr>
+        <w:t xml:space="preserve"> </w:t>
+      </w:r>
+      <w:r>
+        <w:t>Clasificado</w:t>
+      </w:r>
+      <w:r>
+        <w:br/>
+      </w:r>
+      <w:r>
+        <w:rPr>
+          <w:b/>
+          <w:bCs/>
+        </w:rPr>
+        <w:t>Edad:</w:t>
+      </w:r>
+      <w:r>
+        <w:t xml:space="preserve"> 38</w:t>
+      </w:r>
+      <w:r>
+        <w:br/>
+      </w:r>
+      <w:r>
+        <w:rPr>
+          <w:b/>
+          <w:bCs/>
+        </w:rPr>
+        <w:t>Origen:</w:t>
+      </w:r>
+      <w:r>
+        <w:t xml:space="preserve"> Europa del Este (ex unidad especial militar)</w:t>
+      </w:r>
+    </w:p>
+    <w:p>
+      <w:r>
+        <w:t>Descripción:</w:t>
+      </w:r>
+      <w:r>
+        <w:br/>
+        <w:t>Veterano de múltiples operaciones no reconocidas oficialmente. Specter no destaca por agresividad, sino por su capacidad de mantener la cohesión del equipo bajo presión extrema. Habla poco, observa mucho, y nunca toma una decisión sin evaluar rutas de escape.</w:t>
+      </w:r>
+    </w:p>
+    <w:p>
+      <w:r>
+        <w:t>Fue retirado formalmente tras una operación fallida que nunca apareció en registros militares. Desde entonces trabaja en misiones “no atribuibles”.</w:t>
+      </w:r>
+    </w:p>
+    <w:p>
+      <w:r>
+        <w:t>Personalidad:</w:t>
+      </w:r>
+    </w:p>
+    <w:p>
+      <w:r>
+        <w:t xml:space="preserve">- </w:t>
+      </w:r>
+      <w:r>
+        <w:t xml:space="preserve">Frío, analítico, reservado </w:t>
+      </w:r>
+      <w:r>
+        <w:br/>
+        <w:t xml:space="preserve">- </w:t>
+      </w:r>
+      <w:r>
+        <w:t xml:space="preserve">Evita conflictos innecesarios </w:t>
+      </w:r>
+      <w:r>
+        <w:br/>
+        <w:t xml:space="preserve">- </w:t>
+      </w:r>
+      <w:r>
+        <w:t xml:space="preserve">Confía más en la preparación que en la improvisación </w:t>
+      </w:r>
+    </w:p>
+    <w:p>
+      <w:r>
+        <w:t>Estilo de operación:</w:t>
+      </w:r>
+      <w:r>
+        <w:br/>
+        <w:t>Precisión, sigilo, mínima exposición</w:t>
+      </w:r>
+    </w:p>
+    <w:p/>
+    <w:p/>
+    <w:p/>
+    <w:p>
+      <w:pPr>
+        <w:rPr>
+          <w:b/>
+          <w:bCs/>
+        </w:rPr>
+      </w:pPr>
+      <w:r>
+        <w:rPr>
+          <w:b/>
+          <w:bCs/>
+        </w:rPr>
+        <w:lastRenderedPageBreak/>
+        <w:t xml:space="preserve">2. </w:t>
+      </w:r>
+      <w:r>
+        <w:rPr>
+          <w:rFonts w:ascii="Segoe UI Emoji" w:hAnsi="Segoe UI Emoji" w:cs="Segoe UI Emoji"/>
+          <w:b/>
+          <w:bCs/>
+        </w:rPr>
+        <w:t>🔧</w:t>
+      </w:r>
+      <w:r>
+        <w:rPr>
+          <w:b/>
+          <w:bCs/>
+        </w:rPr>
+        <w:t xml:space="preserve"> “Wire” – Ingeniero de brechas / hacker de campo</w:t>
+      </w:r>
+    </w:p>
+    <w:p>
+      <w:r>
+        <w:rPr>
+          <w:b/>
+          <w:bCs/>
+        </w:rPr>
+        <w:t>Nombre real:</w:t>
+      </w:r>
+      <w:r>
+        <w:t xml:space="preserve"> Ethan Keller</w:t>
+      </w:r>
+      <w:r>
+        <w:br/>
+      </w:r>
+      <w:r>
+        <w:rPr>
+          <w:b/>
+          <w:bCs/>
+        </w:rPr>
+        <w:t>Edad:</w:t>
+      </w:r>
+      <w:r>
+        <w:t xml:space="preserve"> 32</w:t>
+      </w:r>
+      <w:r>
+        <w:br/>
+      </w:r>
+      <w:r>
+        <w:rPr>
+          <w:b/>
+          <w:bCs/>
+        </w:rPr>
+        <w:t>Origen:</w:t>
+      </w:r>
+      <w:r>
+        <w:t xml:space="preserve"> EE. UU.</w:t>
+      </w:r>
+    </w:p>
+    <w:p>
+      <w:r>
+        <w:t>Descripción:</w:t>
+      </w:r>
+      <w:r>
+        <w:br/>
+        <w:t>Ex especialista en explosivos de ingenieros militares, posteriormente contratado por una empresa privada de seguridad tecnológica. Abandonó el sistema tras descubrir uso ilegal de su trabajo en operaciones encubiertas.</w:t>
+      </w:r>
+    </w:p>
+    <w:p>
+      <w:r>
+        <w:t>Es el miembro que entiende cómo “romper cualquier sistema”: físico o digital.</w:t>
+      </w:r>
+    </w:p>
+    <w:p>
+      <w:r>
+        <w:t>Personalidad:</w:t>
+      </w:r>
+    </w:p>
+    <w:p>
+      <w:r>
+        <w:t xml:space="preserve">- </w:t>
+      </w:r>
+      <w:r>
+        <w:t xml:space="preserve">Sarcástico, curioso, hablador en situaciones de estrés </w:t>
+      </w:r>
+      <w:r>
+        <w:br/>
+        <w:t xml:space="preserve">- </w:t>
+      </w:r>
+      <w:r>
+        <w:t xml:space="preserve">Obsesionado con cómo funcionan las cosas </w:t>
+      </w:r>
+      <w:r>
+        <w:br/>
+        <w:t xml:space="preserve">- </w:t>
+      </w:r>
+      <w:r>
+        <w:t xml:space="preserve">Tiende a </w:t>
+      </w:r>
+      <w:proofErr w:type="spellStart"/>
+      <w:r>
+        <w:t>sobreanalizar</w:t>
+      </w:r>
+      <w:proofErr w:type="spellEnd"/>
+      <w:r>
+        <w:t xml:space="preserve"> riesgos </w:t>
+      </w:r>
+    </w:p>
+    <w:p>
+      <w:r>
+        <w:t>Estilo de operación:</w:t>
+      </w:r>
+      <w:r>
+        <w:br/>
+        <w:t>Precisión técnica, improvisación con herramientas, soluciones no convencionales</w:t>
+      </w:r>
+    </w:p>
+    <w:p/>
+    <w:p>
+      <w:pPr>
+        <w:rPr>
+          <w:b/>
+          <w:bCs/>
+        </w:rPr>
+      </w:pPr>
+      <w:r>
+        <w:rPr>
+          <w:b/>
+          <w:bCs/>
+        </w:rPr>
+        <w:t xml:space="preserve">3. </w:t>
+      </w:r>
+      <w:r>
+        <w:rPr>
+          <w:rFonts w:ascii="Segoe UI Emoji" w:hAnsi="Segoe UI Emoji" w:cs="Segoe UI Emoji"/>
+          <w:b/>
+          <w:bCs/>
+        </w:rPr>
+        <w:t>🎯</w:t>
+      </w:r>
+      <w:r>
+        <w:rPr>
+          <w:b/>
+          <w:bCs/>
+        </w:rPr>
+        <w:t xml:space="preserve"> “Rook” – Tirador designado (DMR)</w:t>
+      </w:r>
+    </w:p>
+    <w:p>
+      <w:r>
+        <w:rPr>
+          <w:b/>
+          <w:bCs/>
+        </w:rPr>
+        <w:t>Nombre real:</w:t>
+      </w:r>
+      <w:r>
+        <w:t xml:space="preserve"> Lukas Varga</w:t>
+      </w:r>
+      <w:r>
+        <w:br/>
+      </w:r>
+      <w:r>
+        <w:rPr>
+          <w:b/>
+          <w:bCs/>
+        </w:rPr>
+        <w:t>Edad:</w:t>
+      </w:r>
+      <w:r>
+        <w:t xml:space="preserve"> 35</w:t>
+      </w:r>
+      <w:r>
+        <w:br/>
+      </w:r>
+      <w:r>
+        <w:rPr>
+          <w:b/>
+          <w:bCs/>
+        </w:rPr>
+        <w:t>Origen:</w:t>
+      </w:r>
+      <w:r>
+        <w:t xml:space="preserve"> Balcanes</w:t>
+      </w:r>
+    </w:p>
+    <w:p>
+      <w:r>
+        <w:rPr>
+          <w:b/>
+          <w:bCs/>
+        </w:rPr>
+        <w:t>Descripción:</w:t>
+      </w:r>
+      <w:r>
+        <w:br/>
+        <w:t xml:space="preserve">Ex francotirador militar reconvertido en tirador de apoyo. No es un “asesino de largo alcance clásico”, sino un observador disciplinado que protege al equipo </w:t>
+      </w:r>
+      <w:r>
+        <w:t>desde</w:t>
+      </w:r>
+      <w:r>
+        <w:t xml:space="preserve"> posiciones</w:t>
+      </w:r>
+      <w:r>
+        <w:t xml:space="preserve"> medias.</w:t>
+      </w:r>
+    </w:p>
+    <w:p>
+      <w:r>
+        <w:t>Perdió su unidad en una operación de emboscada, lo que lo volvió extremadamente metódico y cauteloso.</w:t>
+      </w:r>
+    </w:p>
+    <w:p>
+      <w:r>
+        <w:rPr>
+          <w:b/>
+          <w:bCs/>
+        </w:rPr>
+        <w:t>Personalidad:</w:t>
+      </w:r>
+    </w:p>
+    <w:p>
+      <w:r>
+        <w:t xml:space="preserve">- </w:t>
+      </w:r>
+      <w:r>
+        <w:t xml:space="preserve">Callado, preciso, emocionalmente distante </w:t>
+      </w:r>
+      <w:r>
+        <w:br/>
+        <w:t xml:space="preserve">- </w:t>
+      </w:r>
+      <w:r>
+        <w:t xml:space="preserve">Paciente hasta el extremo </w:t>
+      </w:r>
+      <w:r>
+        <w:br/>
+        <w:t xml:space="preserve">- </w:t>
+      </w:r>
+      <w:r>
+        <w:t xml:space="preserve">Le cuesta confiar en decisiones impulsivas </w:t>
+      </w:r>
+    </w:p>
+    <w:p>
+      <w:r>
+        <w:lastRenderedPageBreak/>
+        <w:t>Estilo de operación:</w:t>
+      </w:r>
+      <w:r>
+        <w:br/>
+        <w:t>Cobertura, vigilancia, eliminación selectiva</w:t>
+      </w:r>
+    </w:p>
+    <w:p>
+      <w:pPr>
+        <w:rPr>
+          <w:b/>
+          <w:bCs/>
+        </w:rPr>
+      </w:pPr>
+      <w:r>
+        <w:rPr>
+          <w:b/>
+          <w:bCs/>
+        </w:rPr>
+        <w:t xml:space="preserve">4. </w:t>
+      </w:r>
+      <w:r>
+        <w:rPr>
+          <w:rFonts w:ascii="Segoe UI Emoji" w:hAnsi="Segoe UI Emoji" w:cs="Segoe UI Emoji"/>
+          <w:b/>
+          <w:bCs/>
+        </w:rPr>
+        <w:t>💥</w:t>
+      </w:r>
+      <w:r>
+        <w:rPr>
+          <w:b/>
+          <w:bCs/>
+        </w:rPr>
+        <w:t xml:space="preserve"> “Havoc” – Especialista en asalto / </w:t>
+      </w:r>
+      <w:proofErr w:type="spellStart"/>
+      <w:r>
+        <w:rPr>
+          <w:b/>
+          <w:bCs/>
+        </w:rPr>
+        <w:t>breaching</w:t>
+      </w:r>
+      <w:proofErr w:type="spellEnd"/>
+    </w:p>
+    <w:p>
+      <w:r>
+        <w:rPr>
+          <w:b/>
+          <w:bCs/>
+        </w:rPr>
+        <w:t>Nombre real:</w:t>
+      </w:r>
+      <w:r>
+        <w:t xml:space="preserve"> Marcus Reed</w:t>
+      </w:r>
+      <w:r>
+        <w:br/>
+      </w:r>
+      <w:r>
+        <w:rPr>
+          <w:b/>
+          <w:bCs/>
+        </w:rPr>
+        <w:t>Edad:</w:t>
+      </w:r>
+      <w:r>
+        <w:t xml:space="preserve"> 30</w:t>
+      </w:r>
+      <w:r>
+        <w:br/>
+      </w:r>
+      <w:r>
+        <w:rPr>
+          <w:b/>
+          <w:bCs/>
+        </w:rPr>
+        <w:t>Origen:</w:t>
+      </w:r>
+      <w:r>
+        <w:t xml:space="preserve"> Reino Unido</w:t>
+      </w:r>
+    </w:p>
+    <w:p>
+      <w:r>
+        <w:t>Descripción:</w:t>
+      </w:r>
+      <w:r>
+        <w:br/>
+        <w:t>Ex operador de fuerzas de asalto urbano. Entrenado para entrar primero y sobrevivir lo suficiente para asegurar la habitación.</w:t>
+      </w:r>
+    </w:p>
+    <w:p>
+      <w:r>
+        <w:t xml:space="preserve">Tiene reputación de ser </w:t>
+      </w:r>
+      <w:r>
+        <w:t>efectivo,</w:t>
+      </w:r>
+      <w:r>
+        <w:t xml:space="preserve"> pero “ruidoso”, lo que lo hace perfecto para operaciones donde el sigilo ya ha fallado o no es prioridad.</w:t>
+      </w:r>
+    </w:p>
+    <w:p>
+      <w:r>
+        <w:rPr>
+          <w:b/>
+          <w:bCs/>
+        </w:rPr>
+        <w:t>Personalidad:</w:t>
+      </w:r>
+    </w:p>
+    <w:p>
+      <w:r>
+        <w:t xml:space="preserve">- </w:t>
+      </w:r>
+      <w:r>
+        <w:t xml:space="preserve">Directo, impulsivo, confiado </w:t>
+      </w:r>
+      <w:r>
+        <w:br/>
+        <w:t xml:space="preserve">- </w:t>
+      </w:r>
+      <w:r>
+        <w:t xml:space="preserve">Prefiere acción antes que discusión </w:t>
+      </w:r>
+      <w:r>
+        <w:br/>
+        <w:t xml:space="preserve">- </w:t>
+      </w:r>
+      <w:r>
+        <w:t xml:space="preserve">Protector con el equipo </w:t>
+      </w:r>
+    </w:p>
+    <w:p>
+      <w:r>
+        <w:rPr>
+          <w:b/>
+          <w:bCs/>
+        </w:rPr>
+        <w:t>Estilo de operación:</w:t>
+      </w:r>
+      <w:r>
+        <w:br/>
+        <w:t>Entrada rápida, control agresivo de espacios cerrados</w:t>
+      </w:r>
+    </w:p>
+    <w:p>
+      <w:pPr>
+        <w:rPr>
+          <w:b/>
+          <w:bCs/>
+        </w:rPr>
+      </w:pPr>
+      <w:r>
+        <w:rPr>
+          <w:b/>
+          <w:bCs/>
+        </w:rPr>
+        <w:t xml:space="preserve">5. </w:t>
+      </w:r>
+      <w:r>
+        <w:rPr>
+          <w:rFonts w:ascii="Segoe UI Emoji" w:hAnsi="Segoe UI Emoji" w:cs="Segoe UI Emoji"/>
+          <w:b/>
+          <w:bCs/>
+        </w:rPr>
+        <w:t>📡</w:t>
+      </w:r>
+      <w:r>
+        <w:rPr>
+          <w:b/>
+          <w:bCs/>
+        </w:rPr>
+        <w:t xml:space="preserve"> “Echo” – Operador de inteligencia y comunicaciones</w:t>
+      </w:r>
+    </w:p>
+    <w:p>
+      <w:r>
+        <w:rPr>
+          <w:b/>
+          <w:bCs/>
+        </w:rPr>
+        <w:t>Nombre real:</w:t>
+      </w:r>
+      <w:r>
+        <w:t xml:space="preserve"> Daniel Cho</w:t>
+      </w:r>
+      <w:r>
+        <w:br/>
+      </w:r>
+      <w:r>
+        <w:rPr>
+          <w:b/>
+          <w:bCs/>
+        </w:rPr>
+        <w:t>Edad:</w:t>
+      </w:r>
+      <w:r>
+        <w:t xml:space="preserve"> 34</w:t>
+      </w:r>
+      <w:r>
+        <w:br/>
+      </w:r>
+      <w:r>
+        <w:rPr>
+          <w:b/>
+          <w:bCs/>
+        </w:rPr>
+        <w:t>Origen:</w:t>
+      </w:r>
+      <w:r>
+        <w:t xml:space="preserve"> Corea del Sur / EE. UU.</w:t>
+      </w:r>
+    </w:p>
+    <w:p>
+      <w:r>
+        <w:t>Descripción:</w:t>
+      </w:r>
+      <w:r>
+        <w:br/>
+        <w:t>Ex analista de inteligencia militar especializado en comunicaciones interceptadas y coordinación de operaciones remotas. Nunca fue “operador de campo” al inicio, pero pasó a terreno tras perder su equipo durante una operación de extracción fallida.</w:t>
+      </w:r>
+    </w:p>
+    <w:p>
+      <w:r>
+        <w:t>Ahora combina inteligencia digital con apoyo táctico en campo.</w:t>
+      </w:r>
+    </w:p>
+    <w:p>
+      <w:r>
+        <w:t>Personalidad:</w:t>
+      </w:r>
+    </w:p>
+    <w:p>
+      <w:r>
+        <w:t xml:space="preserve">- </w:t>
+      </w:r>
+      <w:r>
+        <w:t xml:space="preserve">Calmado, observador, estratégico </w:t>
+      </w:r>
+      <w:r>
+        <w:br/>
+        <w:t xml:space="preserve">- </w:t>
+      </w:r>
+      <w:r>
+        <w:t xml:space="preserve">Piensa en capas (siempre 2–3 pasos adelante) </w:t>
+      </w:r>
+      <w:r>
+        <w:br/>
+        <w:t xml:space="preserve">- </w:t>
+      </w:r>
+      <w:r>
+        <w:t xml:space="preserve">Mantiene distancia emocional con el combate </w:t>
+      </w:r>
+    </w:p>
+    <w:p>
+      <w:r>
+        <w:lastRenderedPageBreak/>
+        <w:t>Estilo de operación:</w:t>
+      </w:r>
+      <w:r>
+        <w:br/>
+        <w:t>Información, control del entorno, coordinación táctica</w:t>
+      </w:r>
+    </w:p>
+    <w:p>
+      <w:r>
+        <w:t xml:space="preserve">Dinámica del equipo </w:t>
+      </w:r>
+    </w:p>
+    <w:p>
+      <w:r>
+        <w:t xml:space="preserve">- </w:t>
+      </w:r>
+      <w:r>
+        <w:t xml:space="preserve">Specter: toma decisiones finales </w:t>
+      </w:r>
+      <w:r>
+        <w:br/>
+        <w:t xml:space="preserve">- </w:t>
+      </w:r>
+      <w:r>
+        <w:t xml:space="preserve">Wire: abre rutas y sistemas </w:t>
+      </w:r>
+      <w:r>
+        <w:br/>
+        <w:t xml:space="preserve">- </w:t>
+      </w:r>
+      <w:r>
+        <w:t xml:space="preserve">Havoc: ejecuta entradas </w:t>
+      </w:r>
+      <w:r>
+        <w:br/>
+        <w:t xml:space="preserve">- </w:t>
+      </w:r>
+      <w:r>
+        <w:t xml:space="preserve">Rook: cubre y elimina amenazas clave </w:t>
+      </w:r>
+      <w:r>
+        <w:br/>
+        <w:t xml:space="preserve">- </w:t>
+      </w:r>
+      <w:r>
+        <w:t>Echo: mantiene visión general del campo</w:t>
+      </w:r>
+    </w:p>
+    <w:p>
+      <w:r>
+        <w:t xml:space="preserve">La operación se  llevo a cabo desde un portaviones a </w:t>
+      </w:r>
+      <w:r>
+        <w:t>8</w:t>
+      </w:r>
+      <w:r>
+        <w:t xml:space="preserve">0 km de </w:t>
+      </w:r>
+      <w:proofErr w:type="spellStart"/>
+      <w:r>
+        <w:t>francia</w:t>
+      </w:r>
+      <w:proofErr w:type="spellEnd"/>
+    </w:p>
+    <w:p/>
     <w:p>
       <w:pPr>
         <w:rPr>
@@ -1797,6 +2567,953 @@
 <file path=word/numbering.xml><?xml version="1.0" encoding="utf-8"?>
 <w:numbering xmlns:wpc="http://schemas.microsoft.com/office/word/2010/wordprocessingCanvas" xmlns:cx="http://schemas.microsoft.com/office/drawing/2014/chartex" xmlns:cx1="http://schemas.microsoft.com/office/drawing/2015/9/8/chartex" xmlns:cx2="http://schemas.microsoft.com/office/drawing/2015/10/21/chartex" xmlns:cx3="http://schemas.microsoft.com/office/drawing/2016/5/9/chartex" xmlns:cx4="http://schemas.microsoft.com/office/drawing/2016/5/10/chartex" xmlns:cx5="http://schemas.microsoft.com/office/drawing/2016/5/11/chartex" xmlns:cx6="http://schemas.microsoft.com/office/drawing/2016/5/12/chartex" xmlns:cx7="http://schemas.microsoft.com/office/drawing/2016/5/13/chartex" xmlns:cx8="http://schemas.microsoft.com/office/drawing/2016/5/14/chartex" xmlns:mc="http://schemas.openxmlformats.org/markup-compatibility/2006" xmlns:aink="http://schemas.microsoft.com/office/drawing/2016/ink" xmlns:am3d="http://schemas.microsoft.com/office/drawing/2017/model3d" xmlns:o="urn:schemas-microsoft-com:office:office" xmlns:oel="http://schemas.microsoft.com/office/2019/extlst" xmlns:r="http://schemas.openxmlformats.org/officeDocument/2006/relationships" xmlns:m="http://schemas.openxmlformats.org/officeDocument/2006/math" xmlns:v="urn:schemas-microsoft-com:vml" xmlns:wp14="http://schemas.microsoft.com/office/word/2010/wordprocessingDrawing" xmlns:wp="http://schemas.openxmlformats.org/drawingml/2006/wordprocessingDrawing" xmlns:w10="urn:schemas-microsoft-com:office:word" xmlns:w="http://schemas.openxmlformats.org/wordprocessingml/2006/main" xmlns:w14="http://schemas.microsoft.com/office/word/2010/wordml" xmlns:w15="http://schemas.microsoft.com/office/word/2012/wordml" xmlns:w16cex="http://schemas.microsoft.com/office/word/2018/wordml/cex" xmlns:w16cid="http://schemas.microsoft.com/office/word/2016/wordml/cid" xmlns:w16="http://schemas.microsoft.com/office/word/2018/wordml" xmlns:w16sdtdh="http://schemas.microsoft.com/office/word/2020/wordml/sdtdatahash" xmlns:w16se="http://schemas.microsoft.com/office/word/2015/wordml/symex" xmlns:wpg="http://schemas.microsoft.com/office/word/2010/wordprocessingGroup" xmlns:wpi="http://schemas.microsoft.com/office/word/2010/wordprocessingInk" xmlns:wne="http://schemas.microsoft.com/office/word/2006/wordml" xmlns:wps="http://schemas.microsoft.com/office/word/2010/wordprocessingShape" mc:Ignorable="w14 w15 w16se w16cid w16 w16cex w16sdtdh wp14">
   <w:abstractNum w:abstractNumId="0" w15:restartNumberingAfterBreak="0">
+    <w:nsid w:val="00ED2B7D"/>
+    <w:multiLevelType w:val="hybridMultilevel"/>
+    <w:tmpl w:val="8FECBC14"/>
+    <w:lvl w:ilvl="0" w:tplc="1D882B40">
+      <w:start w:val="1"/>
+      <w:numFmt w:val="bullet"/>
+      <w:lvlText w:val="-"/>
+      <w:lvlJc w:val="left"/>
+      <w:pPr>
+        <w:ind w:left="720" w:hanging="360"/>
+      </w:pPr>
+      <w:rPr>
+        <w:rFonts w:ascii="Aptos" w:eastAsiaTheme="minorHAnsi" w:hAnsi="Aptos" w:cstheme="minorBidi" w:hint="default"/>
+      </w:rPr>
+    </w:lvl>
+    <w:lvl w:ilvl="1" w:tplc="340A0003" w:tentative="1">
+      <w:start w:val="1"/>
+      <w:numFmt w:val="bullet"/>
+      <w:lvlText w:val="o"/>
+      <w:lvlJc w:val="left"/>
+      <w:pPr>
+        <w:ind w:left="1440" w:hanging="360"/>
+      </w:pPr>
+      <w:rPr>
+        <w:rFonts w:ascii="Courier New" w:hAnsi="Courier New" w:cs="Courier New" w:hint="default"/>
+      </w:rPr>
+    </w:lvl>
+    <w:lvl w:ilvl="2" w:tplc="340A0005" w:tentative="1">
+      <w:start w:val="1"/>
+      <w:numFmt w:val="bullet"/>
+      <w:lvlText w:val=""/>
+      <w:lvlJc w:val="left"/>
+      <w:pPr>
+        <w:ind w:left="2160" w:hanging="360"/>
+      </w:pPr>
+      <w:rPr>
+        <w:rFonts w:ascii="Wingdings" w:hAnsi="Wingdings" w:hint="default"/>
+      </w:rPr>
+    </w:lvl>
+    <w:lvl w:ilvl="3" w:tplc="340A0001" w:tentative="1">
+      <w:start w:val="1"/>
+      <w:numFmt w:val="bullet"/>
+      <w:lvlText w:val=""/>
+      <w:lvlJc w:val="left"/>
+      <w:pPr>
+        <w:ind w:left="2880" w:hanging="360"/>
+      </w:pPr>
+      <w:rPr>
+        <w:rFonts w:ascii="Symbol" w:hAnsi="Symbol" w:hint="default"/>
+      </w:rPr>
+    </w:lvl>
+    <w:lvl w:ilvl="4" w:tplc="340A0003" w:tentative="1">
+      <w:start w:val="1"/>
+      <w:numFmt w:val="bullet"/>
+      <w:lvlText w:val="o"/>
+      <w:lvlJc w:val="left"/>
+      <w:pPr>
+        <w:ind w:left="3600" w:hanging="360"/>
+      </w:pPr>
+      <w:rPr>
+        <w:rFonts w:ascii="Courier New" w:hAnsi="Courier New" w:cs="Courier New" w:hint="default"/>
+      </w:rPr>
+    </w:lvl>
+    <w:lvl w:ilvl="5" w:tplc="340A0005" w:tentative="1">
+      <w:start w:val="1"/>
+      <w:numFmt w:val="bullet"/>
+      <w:lvlText w:val=""/>
+      <w:lvlJc w:val="left"/>
+      <w:pPr>
+        <w:ind w:left="4320" w:hanging="360"/>
+      </w:pPr>
+      <w:rPr>
+        <w:rFonts w:ascii="Wingdings" w:hAnsi="Wingdings" w:hint="default"/>
+      </w:rPr>
+    </w:lvl>
+    <w:lvl w:ilvl="6" w:tplc="340A0001" w:tentative="1">
+      <w:start w:val="1"/>
+      <w:numFmt w:val="bullet"/>
+      <w:lvlText w:val=""/>
+      <w:lvlJc w:val="left"/>
+      <w:pPr>
+        <w:ind w:left="5040" w:hanging="360"/>
+      </w:pPr>
+      <w:rPr>
+        <w:rFonts w:ascii="Symbol" w:hAnsi="Symbol" w:hint="default"/>
+      </w:rPr>
+    </w:lvl>
+    <w:lvl w:ilvl="7" w:tplc="340A0003" w:tentative="1">
+      <w:start w:val="1"/>
+      <w:numFmt w:val="bullet"/>
+      <w:lvlText w:val="o"/>
+      <w:lvlJc w:val="left"/>
+      <w:pPr>
+        <w:ind w:left="5760" w:hanging="360"/>
+      </w:pPr>
+      <w:rPr>
+        <w:rFonts w:ascii="Courier New" w:hAnsi="Courier New" w:cs="Courier New" w:hint="default"/>
+      </w:rPr>
+    </w:lvl>
+    <w:lvl w:ilvl="8" w:tplc="340A0005" w:tentative="1">
+      <w:start w:val="1"/>
+      <w:numFmt w:val="bullet"/>
+      <w:lvlText w:val=""/>
+      <w:lvlJc w:val="left"/>
+      <w:pPr>
+        <w:ind w:left="6480" w:hanging="360"/>
+      </w:pPr>
+      <w:rPr>
+        <w:rFonts w:ascii="Wingdings" w:hAnsi="Wingdings" w:hint="default"/>
+      </w:rPr>
+    </w:lvl>
+  </w:abstractNum>
+  <w:abstractNum w:abstractNumId="1" w15:restartNumberingAfterBreak="0">
+    <w:nsid w:val="1E16694D"/>
+    <w:multiLevelType w:val="multilevel"/>
+    <w:tmpl w:val="0C9636E0"/>
+    <w:lvl w:ilvl="0">
+      <w:start w:val="1"/>
+      <w:numFmt w:val="bullet"/>
+      <w:lvlText w:val=""/>
+      <w:lvlJc w:val="left"/>
+      <w:pPr>
+        <w:tabs>
+          <w:tab w:val="num" w:pos="720"/>
+        </w:tabs>
+        <w:ind w:left="720" w:hanging="360"/>
+      </w:pPr>
+      <w:rPr>
+        <w:rFonts w:ascii="Symbol" w:hAnsi="Symbol" w:hint="default"/>
+        <w:sz w:val="20"/>
+      </w:rPr>
+    </w:lvl>
+    <w:lvl w:ilvl="1" w:tentative="1">
+      <w:start w:val="1"/>
+      <w:numFmt w:val="bullet"/>
+      <w:lvlText w:val="o"/>
+      <w:lvlJc w:val="left"/>
+      <w:pPr>
+        <w:tabs>
+          <w:tab w:val="num" w:pos="1440"/>
+        </w:tabs>
+        <w:ind w:left="1440" w:hanging="360"/>
+      </w:pPr>
+      <w:rPr>
+        <w:rFonts w:ascii="Courier New" w:hAnsi="Courier New" w:hint="default"/>
+        <w:sz w:val="20"/>
+      </w:rPr>
+    </w:lvl>
+    <w:lvl w:ilvl="2" w:tentative="1">
+      <w:start w:val="1"/>
+      <w:numFmt w:val="bullet"/>
+      <w:lvlText w:val=""/>
+      <w:lvlJc w:val="left"/>
+      <w:pPr>
+        <w:tabs>
+          <w:tab w:val="num" w:pos="2160"/>
+        </w:tabs>
+        <w:ind w:left="2160" w:hanging="360"/>
+      </w:pPr>
+      <w:rPr>
+        <w:rFonts w:ascii="Wingdings" w:hAnsi="Wingdings" w:hint="default"/>
+        <w:sz w:val="20"/>
+      </w:rPr>
+    </w:lvl>
+    <w:lvl w:ilvl="3" w:tentative="1">
+      <w:start w:val="1"/>
+      <w:numFmt w:val="bullet"/>
+      <w:lvlText w:val=""/>
+      <w:lvlJc w:val="left"/>
+      <w:pPr>
+        <w:tabs>
+          <w:tab w:val="num" w:pos="2880"/>
+        </w:tabs>
+        <w:ind w:left="2880" w:hanging="360"/>
+      </w:pPr>
+      <w:rPr>
+        <w:rFonts w:ascii="Wingdings" w:hAnsi="Wingdings" w:hint="default"/>
+        <w:sz w:val="20"/>
+      </w:rPr>
+    </w:lvl>
+    <w:lvl w:ilvl="4" w:tentative="1">
+      <w:start w:val="1"/>
+      <w:numFmt w:val="bullet"/>
+      <w:lvlText w:val=""/>
+      <w:lvlJc w:val="left"/>
+      <w:pPr>
+        <w:tabs>
+          <w:tab w:val="num" w:pos="3600"/>
+        </w:tabs>
+        <w:ind w:left="3600" w:hanging="360"/>
+      </w:pPr>
+      <w:rPr>
+        <w:rFonts w:ascii="Wingdings" w:hAnsi="Wingdings" w:hint="default"/>
+        <w:sz w:val="20"/>
+      </w:rPr>
+    </w:lvl>
+    <w:lvl w:ilvl="5" w:tentative="1">
+      <w:start w:val="1"/>
+      <w:numFmt w:val="bullet"/>
+      <w:lvlText w:val=""/>
+      <w:lvlJc w:val="left"/>
+      <w:pPr>
+        <w:tabs>
+          <w:tab w:val="num" w:pos="4320"/>
+        </w:tabs>
+        <w:ind w:left="4320" w:hanging="360"/>
+      </w:pPr>
+      <w:rPr>
+        <w:rFonts w:ascii="Wingdings" w:hAnsi="Wingdings" w:hint="default"/>
+        <w:sz w:val="20"/>
+      </w:rPr>
+    </w:lvl>
+    <w:lvl w:ilvl="6" w:tentative="1">
+      <w:start w:val="1"/>
+      <w:numFmt w:val="bullet"/>
+      <w:lvlText w:val=""/>
+      <w:lvlJc w:val="left"/>
+      <w:pPr>
+        <w:tabs>
+          <w:tab w:val="num" w:pos="5040"/>
+        </w:tabs>
+        <w:ind w:left="5040" w:hanging="360"/>
+      </w:pPr>
+      <w:rPr>
+        <w:rFonts w:ascii="Wingdings" w:hAnsi="Wingdings" w:hint="default"/>
+        <w:sz w:val="20"/>
+      </w:rPr>
+    </w:lvl>
+    <w:lvl w:ilvl="7" w:tentative="1">
+      <w:start w:val="1"/>
+      <w:numFmt w:val="bullet"/>
+      <w:lvlText w:val=""/>
+      <w:lvlJc w:val="left"/>
+      <w:pPr>
+        <w:tabs>
+          <w:tab w:val="num" w:pos="5760"/>
+        </w:tabs>
+        <w:ind w:left="5760" w:hanging="360"/>
+      </w:pPr>
+      <w:rPr>
+        <w:rFonts w:ascii="Wingdings" w:hAnsi="Wingdings" w:hint="default"/>
+        <w:sz w:val="20"/>
+      </w:rPr>
+    </w:lvl>
+    <w:lvl w:ilvl="8" w:tentative="1">
+      <w:start w:val="1"/>
+      <w:numFmt w:val="bullet"/>
+      <w:lvlText w:val=""/>
+      <w:lvlJc w:val="left"/>
+      <w:pPr>
+        <w:tabs>
+          <w:tab w:val="num" w:pos="6480"/>
+        </w:tabs>
+        <w:ind w:left="6480" w:hanging="360"/>
+      </w:pPr>
+      <w:rPr>
+        <w:rFonts w:ascii="Wingdings" w:hAnsi="Wingdings" w:hint="default"/>
+        <w:sz w:val="20"/>
+      </w:rPr>
+    </w:lvl>
+  </w:abstractNum>
+  <w:abstractNum w:abstractNumId="2" w15:restartNumberingAfterBreak="0">
+    <w:nsid w:val="22542AF4"/>
+    <w:multiLevelType w:val="multilevel"/>
+    <w:tmpl w:val="FA22A0D8"/>
+    <w:lvl w:ilvl="0">
+      <w:start w:val="1"/>
+      <w:numFmt w:val="bullet"/>
+      <w:lvlText w:val=""/>
+      <w:lvlJc w:val="left"/>
+      <w:pPr>
+        <w:tabs>
+          <w:tab w:val="num" w:pos="720"/>
+        </w:tabs>
+        <w:ind w:left="720" w:hanging="360"/>
+      </w:pPr>
+      <w:rPr>
+        <w:rFonts w:ascii="Symbol" w:hAnsi="Symbol" w:hint="default"/>
+        <w:sz w:val="20"/>
+      </w:rPr>
+    </w:lvl>
+    <w:lvl w:ilvl="1" w:tentative="1">
+      <w:start w:val="1"/>
+      <w:numFmt w:val="bullet"/>
+      <w:lvlText w:val="o"/>
+      <w:lvlJc w:val="left"/>
+      <w:pPr>
+        <w:tabs>
+          <w:tab w:val="num" w:pos="1440"/>
+        </w:tabs>
+        <w:ind w:left="1440" w:hanging="360"/>
+      </w:pPr>
+      <w:rPr>
+        <w:rFonts w:ascii="Courier New" w:hAnsi="Courier New" w:hint="default"/>
+        <w:sz w:val="20"/>
+      </w:rPr>
+    </w:lvl>
+    <w:lvl w:ilvl="2" w:tentative="1">
+      <w:start w:val="1"/>
+      <w:numFmt w:val="bullet"/>
+      <w:lvlText w:val=""/>
+      <w:lvlJc w:val="left"/>
+      <w:pPr>
+        <w:tabs>
+          <w:tab w:val="num" w:pos="2160"/>
+        </w:tabs>
+        <w:ind w:left="2160" w:hanging="360"/>
+      </w:pPr>
+      <w:rPr>
+        <w:rFonts w:ascii="Wingdings" w:hAnsi="Wingdings" w:hint="default"/>
+        <w:sz w:val="20"/>
+      </w:rPr>
+    </w:lvl>
+    <w:lvl w:ilvl="3" w:tentative="1">
+      <w:start w:val="1"/>
+      <w:numFmt w:val="bullet"/>
+      <w:lvlText w:val=""/>
+      <w:lvlJc w:val="left"/>
+      <w:pPr>
+        <w:tabs>
+          <w:tab w:val="num" w:pos="2880"/>
+        </w:tabs>
+        <w:ind w:left="2880" w:hanging="360"/>
+      </w:pPr>
+      <w:rPr>
+        <w:rFonts w:ascii="Wingdings" w:hAnsi="Wingdings" w:hint="default"/>
+        <w:sz w:val="20"/>
+      </w:rPr>
+    </w:lvl>
+    <w:lvl w:ilvl="4" w:tentative="1">
+      <w:start w:val="1"/>
+      <w:numFmt w:val="bullet"/>
+      <w:lvlText w:val=""/>
+      <w:lvlJc w:val="left"/>
+      <w:pPr>
+        <w:tabs>
+          <w:tab w:val="num" w:pos="3600"/>
+        </w:tabs>
+        <w:ind w:left="3600" w:hanging="360"/>
+      </w:pPr>
+      <w:rPr>
+        <w:rFonts w:ascii="Wingdings" w:hAnsi="Wingdings" w:hint="default"/>
+        <w:sz w:val="20"/>
+      </w:rPr>
+    </w:lvl>
+    <w:lvl w:ilvl="5" w:tentative="1">
+      <w:start w:val="1"/>
+      <w:numFmt w:val="bullet"/>
+      <w:lvlText w:val=""/>
+      <w:lvlJc w:val="left"/>
+      <w:pPr>
+        <w:tabs>
+          <w:tab w:val="num" w:pos="4320"/>
+        </w:tabs>
+        <w:ind w:left="4320" w:hanging="360"/>
+      </w:pPr>
+      <w:rPr>
+        <w:rFonts w:ascii="Wingdings" w:hAnsi="Wingdings" w:hint="default"/>
+        <w:sz w:val="20"/>
+      </w:rPr>
+    </w:lvl>
+    <w:lvl w:ilvl="6" w:tentative="1">
+      <w:start w:val="1"/>
+      <w:numFmt w:val="bullet"/>
+      <w:lvlText w:val=""/>
+      <w:lvlJc w:val="left"/>
+      <w:pPr>
+        <w:tabs>
+          <w:tab w:val="num" w:pos="5040"/>
+        </w:tabs>
+        <w:ind w:left="5040" w:hanging="360"/>
+      </w:pPr>
+      <w:rPr>
+        <w:rFonts w:ascii="Wingdings" w:hAnsi="Wingdings" w:hint="default"/>
+        <w:sz w:val="20"/>
+      </w:rPr>
+    </w:lvl>
+    <w:lvl w:ilvl="7" w:tentative="1">
+      <w:start w:val="1"/>
+      <w:numFmt w:val="bullet"/>
+      <w:lvlText w:val=""/>
+      <w:lvlJc w:val="left"/>
+      <w:pPr>
+        <w:tabs>
+          <w:tab w:val="num" w:pos="5760"/>
+        </w:tabs>
+        <w:ind w:left="5760" w:hanging="360"/>
+      </w:pPr>
+      <w:rPr>
+        <w:rFonts w:ascii="Wingdings" w:hAnsi="Wingdings" w:hint="default"/>
+        <w:sz w:val="20"/>
+      </w:rPr>
+    </w:lvl>
+    <w:lvl w:ilvl="8" w:tentative="1">
+      <w:start w:val="1"/>
+      <w:numFmt w:val="bullet"/>
+      <w:lvlText w:val=""/>
+      <w:lvlJc w:val="left"/>
+      <w:pPr>
+        <w:tabs>
+          <w:tab w:val="num" w:pos="6480"/>
+        </w:tabs>
+        <w:ind w:left="6480" w:hanging="360"/>
+      </w:pPr>
+      <w:rPr>
+        <w:rFonts w:ascii="Wingdings" w:hAnsi="Wingdings" w:hint="default"/>
+        <w:sz w:val="20"/>
+      </w:rPr>
+    </w:lvl>
+  </w:abstractNum>
+  <w:abstractNum w:abstractNumId="3" w15:restartNumberingAfterBreak="0">
+    <w:nsid w:val="2AE7279E"/>
+    <w:multiLevelType w:val="multilevel"/>
+    <w:tmpl w:val="10FE52F0"/>
+    <w:lvl w:ilvl="0">
+      <w:start w:val="1"/>
+      <w:numFmt w:val="bullet"/>
+      <w:lvlText w:val=""/>
+      <w:lvlJc w:val="left"/>
+      <w:pPr>
+        <w:tabs>
+          <w:tab w:val="num" w:pos="720"/>
+        </w:tabs>
+        <w:ind w:left="720" w:hanging="360"/>
+      </w:pPr>
+      <w:rPr>
+        <w:rFonts w:ascii="Symbol" w:hAnsi="Symbol" w:hint="default"/>
+        <w:sz w:val="20"/>
+      </w:rPr>
+    </w:lvl>
+    <w:lvl w:ilvl="1" w:tentative="1">
+      <w:start w:val="1"/>
+      <w:numFmt w:val="bullet"/>
+      <w:lvlText w:val="o"/>
+      <w:lvlJc w:val="left"/>
+      <w:pPr>
+        <w:tabs>
+          <w:tab w:val="num" w:pos="1440"/>
+        </w:tabs>
+        <w:ind w:left="1440" w:hanging="360"/>
+      </w:pPr>
+      <w:rPr>
+        <w:rFonts w:ascii="Courier New" w:hAnsi="Courier New" w:hint="default"/>
+        <w:sz w:val="20"/>
+      </w:rPr>
+    </w:lvl>
+    <w:lvl w:ilvl="2" w:tentative="1">
+      <w:start w:val="1"/>
+      <w:numFmt w:val="bullet"/>
+      <w:lvlText w:val=""/>
+      <w:lvlJc w:val="left"/>
+      <w:pPr>
+        <w:tabs>
+          <w:tab w:val="num" w:pos="2160"/>
+        </w:tabs>
+        <w:ind w:left="2160" w:hanging="360"/>
+      </w:pPr>
+      <w:rPr>
+        <w:rFonts w:ascii="Wingdings" w:hAnsi="Wingdings" w:hint="default"/>
+        <w:sz w:val="20"/>
+      </w:rPr>
+    </w:lvl>
+    <w:lvl w:ilvl="3" w:tentative="1">
+      <w:start w:val="1"/>
+      <w:numFmt w:val="bullet"/>
+      <w:lvlText w:val=""/>
+      <w:lvlJc w:val="left"/>
+      <w:pPr>
+        <w:tabs>
+          <w:tab w:val="num" w:pos="2880"/>
+        </w:tabs>
+        <w:ind w:left="2880" w:hanging="360"/>
+      </w:pPr>
+      <w:rPr>
+        <w:rFonts w:ascii="Wingdings" w:hAnsi="Wingdings" w:hint="default"/>
+        <w:sz w:val="20"/>
+      </w:rPr>
+    </w:lvl>
+    <w:lvl w:ilvl="4" w:tentative="1">
+      <w:start w:val="1"/>
+      <w:numFmt w:val="bullet"/>
+      <w:lvlText w:val=""/>
+      <w:lvlJc w:val="left"/>
+      <w:pPr>
+        <w:tabs>
+          <w:tab w:val="num" w:pos="3600"/>
+        </w:tabs>
+        <w:ind w:left="3600" w:hanging="360"/>
+      </w:pPr>
+      <w:rPr>
+        <w:rFonts w:ascii="Wingdings" w:hAnsi="Wingdings" w:hint="default"/>
+        <w:sz w:val="20"/>
+      </w:rPr>
+    </w:lvl>
+    <w:lvl w:ilvl="5" w:tentative="1">
+      <w:start w:val="1"/>
+      <w:numFmt w:val="bullet"/>
+      <w:lvlText w:val=""/>
+      <w:lvlJc w:val="left"/>
+      <w:pPr>
+        <w:tabs>
+          <w:tab w:val="num" w:pos="4320"/>
+        </w:tabs>
+        <w:ind w:left="4320" w:hanging="360"/>
+      </w:pPr>
+      <w:rPr>
+        <w:rFonts w:ascii="Wingdings" w:hAnsi="Wingdings" w:hint="default"/>
+        <w:sz w:val="20"/>
+      </w:rPr>
+    </w:lvl>
+    <w:lvl w:ilvl="6" w:tentative="1">
+      <w:start w:val="1"/>
+      <w:numFmt w:val="bullet"/>
+      <w:lvlText w:val=""/>
+      <w:lvlJc w:val="left"/>
+      <w:pPr>
+        <w:tabs>
+          <w:tab w:val="num" w:pos="5040"/>
+        </w:tabs>
+        <w:ind w:left="5040" w:hanging="360"/>
+      </w:pPr>
+      <w:rPr>
+        <w:rFonts w:ascii="Wingdings" w:hAnsi="Wingdings" w:hint="default"/>
+        <w:sz w:val="20"/>
+      </w:rPr>
+    </w:lvl>
+    <w:lvl w:ilvl="7" w:tentative="1">
+      <w:start w:val="1"/>
+      <w:numFmt w:val="bullet"/>
+      <w:lvlText w:val=""/>
+      <w:lvlJc w:val="left"/>
+      <w:pPr>
+        <w:tabs>
+          <w:tab w:val="num" w:pos="5760"/>
+        </w:tabs>
+        <w:ind w:left="5760" w:hanging="360"/>
+      </w:pPr>
+      <w:rPr>
+        <w:rFonts w:ascii="Wingdings" w:hAnsi="Wingdings" w:hint="default"/>
+        <w:sz w:val="20"/>
+      </w:rPr>
+    </w:lvl>
+    <w:lvl w:ilvl="8" w:tentative="1">
+      <w:start w:val="1"/>
+      <w:numFmt w:val="bullet"/>
+      <w:lvlText w:val=""/>
+      <w:lvlJc w:val="left"/>
+      <w:pPr>
+        <w:tabs>
+          <w:tab w:val="num" w:pos="6480"/>
+        </w:tabs>
+        <w:ind w:left="6480" w:hanging="360"/>
+      </w:pPr>
+      <w:rPr>
+        <w:rFonts w:ascii="Wingdings" w:hAnsi="Wingdings" w:hint="default"/>
+        <w:sz w:val="20"/>
+      </w:rPr>
+    </w:lvl>
+  </w:abstractNum>
+  <w:abstractNum w:abstractNumId="4" w15:restartNumberingAfterBreak="0">
+    <w:nsid w:val="430C55BE"/>
+    <w:multiLevelType w:val="multilevel"/>
+    <w:tmpl w:val="2196D39E"/>
+    <w:lvl w:ilvl="0">
+      <w:start w:val="1"/>
+      <w:numFmt w:val="bullet"/>
+      <w:lvlText w:val=""/>
+      <w:lvlJc w:val="left"/>
+      <w:pPr>
+        <w:tabs>
+          <w:tab w:val="num" w:pos="720"/>
+        </w:tabs>
+        <w:ind w:left="720" w:hanging="360"/>
+      </w:pPr>
+      <w:rPr>
+        <w:rFonts w:ascii="Symbol" w:hAnsi="Symbol" w:hint="default"/>
+        <w:sz w:val="20"/>
+      </w:rPr>
+    </w:lvl>
+    <w:lvl w:ilvl="1" w:tentative="1">
+      <w:start w:val="1"/>
+      <w:numFmt w:val="bullet"/>
+      <w:lvlText w:val="o"/>
+      <w:lvlJc w:val="left"/>
+      <w:pPr>
+        <w:tabs>
+          <w:tab w:val="num" w:pos="1440"/>
+        </w:tabs>
+        <w:ind w:left="1440" w:hanging="360"/>
+      </w:pPr>
+      <w:rPr>
+        <w:rFonts w:ascii="Courier New" w:hAnsi="Courier New" w:hint="default"/>
+        <w:sz w:val="20"/>
+      </w:rPr>
+    </w:lvl>
+    <w:lvl w:ilvl="2" w:tentative="1">
+      <w:start w:val="1"/>
+      <w:numFmt w:val="bullet"/>
+      <w:lvlText w:val=""/>
+      <w:lvlJc w:val="left"/>
+      <w:pPr>
+        <w:tabs>
+          <w:tab w:val="num" w:pos="2160"/>
+        </w:tabs>
+        <w:ind w:left="2160" w:hanging="360"/>
+      </w:pPr>
+      <w:rPr>
+        <w:rFonts w:ascii="Wingdings" w:hAnsi="Wingdings" w:hint="default"/>
+        <w:sz w:val="20"/>
+      </w:rPr>
+    </w:lvl>
+    <w:lvl w:ilvl="3" w:tentative="1">
+      <w:start w:val="1"/>
+      <w:numFmt w:val="bullet"/>
+      <w:lvlText w:val=""/>
+      <w:lvlJc w:val="left"/>
+      <w:pPr>
+        <w:tabs>
+          <w:tab w:val="num" w:pos="2880"/>
+        </w:tabs>
+        <w:ind w:left="2880" w:hanging="360"/>
+      </w:pPr>
+      <w:rPr>
+        <w:rFonts w:ascii="Wingdings" w:hAnsi="Wingdings" w:hint="default"/>
+        <w:sz w:val="20"/>
+      </w:rPr>
+    </w:lvl>
+    <w:lvl w:ilvl="4" w:tentative="1">
+      <w:start w:val="1"/>
+      <w:numFmt w:val="bullet"/>
+      <w:lvlText w:val=""/>
+      <w:lvlJc w:val="left"/>
+      <w:pPr>
+        <w:tabs>
+          <w:tab w:val="num" w:pos="3600"/>
+        </w:tabs>
+        <w:ind w:left="3600" w:hanging="360"/>
+      </w:pPr>
+      <w:rPr>
+        <w:rFonts w:ascii="Wingdings" w:hAnsi="Wingdings" w:hint="default"/>
+        <w:sz w:val="20"/>
+      </w:rPr>
+    </w:lvl>
+    <w:lvl w:ilvl="5" w:tentative="1">
+      <w:start w:val="1"/>
+      <w:numFmt w:val="bullet"/>
+      <w:lvlText w:val=""/>
+      <w:lvlJc w:val="left"/>
+      <w:pPr>
+        <w:tabs>
+          <w:tab w:val="num" w:pos="4320"/>
+        </w:tabs>
+        <w:ind w:left="4320" w:hanging="360"/>
+      </w:pPr>
+      <w:rPr>
+        <w:rFonts w:ascii="Wingdings" w:hAnsi="Wingdings" w:hint="default"/>
+        <w:sz w:val="20"/>
+      </w:rPr>
+    </w:lvl>
+    <w:lvl w:ilvl="6" w:tentative="1">
+      <w:start w:val="1"/>
+      <w:numFmt w:val="bullet"/>
+      <w:lvlText w:val=""/>
+      <w:lvlJc w:val="left"/>
+      <w:pPr>
+        <w:tabs>
+          <w:tab w:val="num" w:pos="5040"/>
+        </w:tabs>
+        <w:ind w:left="5040" w:hanging="360"/>
+      </w:pPr>
+      <w:rPr>
+        <w:rFonts w:ascii="Wingdings" w:hAnsi="Wingdings" w:hint="default"/>
+        <w:sz w:val="20"/>
+      </w:rPr>
+    </w:lvl>
+    <w:lvl w:ilvl="7" w:tentative="1">
+      <w:start w:val="1"/>
+      <w:numFmt w:val="bullet"/>
+      <w:lvlText w:val=""/>
+      <w:lvlJc w:val="left"/>
+      <w:pPr>
+        <w:tabs>
+          <w:tab w:val="num" w:pos="5760"/>
+        </w:tabs>
+        <w:ind w:left="5760" w:hanging="360"/>
+      </w:pPr>
+      <w:rPr>
+        <w:rFonts w:ascii="Wingdings" w:hAnsi="Wingdings" w:hint="default"/>
+        <w:sz w:val="20"/>
+      </w:rPr>
+    </w:lvl>
+    <w:lvl w:ilvl="8" w:tentative="1">
+      <w:start w:val="1"/>
+      <w:numFmt w:val="bullet"/>
+      <w:lvlText w:val=""/>
+      <w:lvlJc w:val="left"/>
+      <w:pPr>
+        <w:tabs>
+          <w:tab w:val="num" w:pos="6480"/>
+        </w:tabs>
+        <w:ind w:left="6480" w:hanging="360"/>
+      </w:pPr>
+      <w:rPr>
+        <w:rFonts w:ascii="Wingdings" w:hAnsi="Wingdings" w:hint="default"/>
+        <w:sz w:val="20"/>
+      </w:rPr>
+    </w:lvl>
+  </w:abstractNum>
+  <w:abstractNum w:abstractNumId="5" w15:restartNumberingAfterBreak="0">
+    <w:nsid w:val="45D83D13"/>
+    <w:multiLevelType w:val="multilevel"/>
+    <w:tmpl w:val="7102D62A"/>
+    <w:lvl w:ilvl="0">
+      <w:start w:val="1"/>
+      <w:numFmt w:val="bullet"/>
+      <w:lvlText w:val=""/>
+      <w:lvlJc w:val="left"/>
+      <w:pPr>
+        <w:tabs>
+          <w:tab w:val="num" w:pos="720"/>
+        </w:tabs>
+        <w:ind w:left="720" w:hanging="360"/>
+      </w:pPr>
+      <w:rPr>
+        <w:rFonts w:ascii="Symbol" w:hAnsi="Symbol" w:hint="default"/>
+        <w:sz w:val="20"/>
+      </w:rPr>
+    </w:lvl>
+    <w:lvl w:ilvl="1" w:tentative="1">
+      <w:start w:val="1"/>
+      <w:numFmt w:val="bullet"/>
+      <w:lvlText w:val="o"/>
+      <w:lvlJc w:val="left"/>
+      <w:pPr>
+        <w:tabs>
+          <w:tab w:val="num" w:pos="1440"/>
+        </w:tabs>
+        <w:ind w:left="1440" w:hanging="360"/>
+      </w:pPr>
+      <w:rPr>
+        <w:rFonts w:ascii="Courier New" w:hAnsi="Courier New" w:hint="default"/>
+        <w:sz w:val="20"/>
+      </w:rPr>
+    </w:lvl>
+    <w:lvl w:ilvl="2" w:tentative="1">
+      <w:start w:val="1"/>
+      <w:numFmt w:val="bullet"/>
+      <w:lvlText w:val=""/>
+      <w:lvlJc w:val="left"/>
+      <w:pPr>
+        <w:tabs>
+          <w:tab w:val="num" w:pos="2160"/>
+        </w:tabs>
+        <w:ind w:left="2160" w:hanging="360"/>
+      </w:pPr>
+      <w:rPr>
+        <w:rFonts w:ascii="Wingdings" w:hAnsi="Wingdings" w:hint="default"/>
+        <w:sz w:val="20"/>
+      </w:rPr>
+    </w:lvl>
+    <w:lvl w:ilvl="3" w:tentative="1">
+      <w:start w:val="1"/>
+      <w:numFmt w:val="bullet"/>
+      <w:lvlText w:val=""/>
+      <w:lvlJc w:val="left"/>
+      <w:pPr>
+        <w:tabs>
+          <w:tab w:val="num" w:pos="2880"/>
+        </w:tabs>
+        <w:ind w:left="2880" w:hanging="360"/>
+      </w:pPr>
+      <w:rPr>
+        <w:rFonts w:ascii="Wingdings" w:hAnsi="Wingdings" w:hint="default"/>
+        <w:sz w:val="20"/>
+      </w:rPr>
+    </w:lvl>
+    <w:lvl w:ilvl="4" w:tentative="1">
+      <w:start w:val="1"/>
+      <w:numFmt w:val="bullet"/>
+      <w:lvlText w:val=""/>
+      <w:lvlJc w:val="left"/>
+      <w:pPr>
+        <w:tabs>
+          <w:tab w:val="num" w:pos="3600"/>
+        </w:tabs>
+        <w:ind w:left="3600" w:hanging="360"/>
+      </w:pPr>
+      <w:rPr>
+        <w:rFonts w:ascii="Wingdings" w:hAnsi="Wingdings" w:hint="default"/>
+        <w:sz w:val="20"/>
+      </w:rPr>
+    </w:lvl>
+    <w:lvl w:ilvl="5" w:tentative="1">
+      <w:start w:val="1"/>
+      <w:numFmt w:val="bullet"/>
+      <w:lvlText w:val=""/>
+      <w:lvlJc w:val="left"/>
+      <w:pPr>
+        <w:tabs>
+          <w:tab w:val="num" w:pos="4320"/>
+        </w:tabs>
+        <w:ind w:left="4320" w:hanging="360"/>
+      </w:pPr>
+      <w:rPr>
+        <w:rFonts w:ascii="Wingdings" w:hAnsi="Wingdings" w:hint="default"/>
+        <w:sz w:val="20"/>
+      </w:rPr>
+    </w:lvl>
+    <w:lvl w:ilvl="6" w:tentative="1">
+      <w:start w:val="1"/>
+      <w:numFmt w:val="bullet"/>
+      <w:lvlText w:val=""/>
+      <w:lvlJc w:val="left"/>
+      <w:pPr>
+        <w:tabs>
+          <w:tab w:val="num" w:pos="5040"/>
+        </w:tabs>
+        <w:ind w:left="5040" w:hanging="360"/>
+      </w:pPr>
+      <w:rPr>
+        <w:rFonts w:ascii="Wingdings" w:hAnsi="Wingdings" w:hint="default"/>
+        <w:sz w:val="20"/>
+      </w:rPr>
+    </w:lvl>
+    <w:lvl w:ilvl="7" w:tentative="1">
+      <w:start w:val="1"/>
+      <w:numFmt w:val="bullet"/>
+      <w:lvlText w:val=""/>
+      <w:lvlJc w:val="left"/>
+      <w:pPr>
+        <w:tabs>
+          <w:tab w:val="num" w:pos="5760"/>
+        </w:tabs>
+        <w:ind w:left="5760" w:hanging="360"/>
+      </w:pPr>
+      <w:rPr>
+        <w:rFonts w:ascii="Wingdings" w:hAnsi="Wingdings" w:hint="default"/>
+        <w:sz w:val="20"/>
+      </w:rPr>
+    </w:lvl>
+    <w:lvl w:ilvl="8" w:tentative="1">
+      <w:start w:val="1"/>
+      <w:numFmt w:val="bullet"/>
+      <w:lvlText w:val=""/>
+      <w:lvlJc w:val="left"/>
+      <w:pPr>
+        <w:tabs>
+          <w:tab w:val="num" w:pos="6480"/>
+        </w:tabs>
+        <w:ind w:left="6480" w:hanging="360"/>
+      </w:pPr>
+      <w:rPr>
+        <w:rFonts w:ascii="Wingdings" w:hAnsi="Wingdings" w:hint="default"/>
+        <w:sz w:val="20"/>
+      </w:rPr>
+    </w:lvl>
+  </w:abstractNum>
+  <w:abstractNum w:abstractNumId="6" w15:restartNumberingAfterBreak="0">
+    <w:nsid w:val="471B1E49"/>
+    <w:multiLevelType w:val="hybridMultilevel"/>
+    <w:tmpl w:val="8EC83722"/>
+    <w:lvl w:ilvl="0" w:tplc="340A000F">
+      <w:start w:val="1"/>
+      <w:numFmt w:val="decimal"/>
+      <w:lvlText w:val="%1."/>
+      <w:lvlJc w:val="left"/>
+      <w:pPr>
+        <w:ind w:left="720" w:hanging="360"/>
+      </w:pPr>
+      <w:rPr>
+        <w:rFonts w:hint="default"/>
+      </w:rPr>
+    </w:lvl>
+    <w:lvl w:ilvl="1" w:tplc="340A0019" w:tentative="1">
+      <w:start w:val="1"/>
+      <w:numFmt w:val="lowerLetter"/>
+      <w:lvlText w:val="%2."/>
+      <w:lvlJc w:val="left"/>
+      <w:pPr>
+        <w:ind w:left="1440" w:hanging="360"/>
+      </w:pPr>
+    </w:lvl>
+    <w:lvl w:ilvl="2" w:tplc="340A001B" w:tentative="1">
+      <w:start w:val="1"/>
+      <w:numFmt w:val="lowerRoman"/>
+      <w:lvlText w:val="%3."/>
+      <w:lvlJc w:val="right"/>
+      <w:pPr>
+        <w:ind w:left="2160" w:hanging="180"/>
+      </w:pPr>
+    </w:lvl>
+    <w:lvl w:ilvl="3" w:tplc="340A000F" w:tentative="1">
+      <w:start w:val="1"/>
+      <w:numFmt w:val="decimal"/>
+      <w:lvlText w:val="%4."/>
+      <w:lvlJc w:val="left"/>
+      <w:pPr>
+        <w:ind w:left="2880" w:hanging="360"/>
+      </w:pPr>
+    </w:lvl>
+    <w:lvl w:ilvl="4" w:tplc="340A0019" w:tentative="1">
+      <w:start w:val="1"/>
+      <w:numFmt w:val="lowerLetter"/>
+      <w:lvlText w:val="%5."/>
+      <w:lvlJc w:val="left"/>
+      <w:pPr>
+        <w:ind w:left="3600" w:hanging="360"/>
+      </w:pPr>
+    </w:lvl>
+    <w:lvl w:ilvl="5" w:tplc="340A001B" w:tentative="1">
+      <w:start w:val="1"/>
+      <w:numFmt w:val="lowerRoman"/>
+      <w:lvlText w:val="%6."/>
+      <w:lvlJc w:val="right"/>
+      <w:pPr>
+        <w:ind w:left="4320" w:hanging="180"/>
+      </w:pPr>
+    </w:lvl>
+    <w:lvl w:ilvl="6" w:tplc="340A000F" w:tentative="1">
+      <w:start w:val="1"/>
+      <w:numFmt w:val="decimal"/>
+      <w:lvlText w:val="%7."/>
+      <w:lvlJc w:val="left"/>
+      <w:pPr>
+        <w:ind w:left="5040" w:hanging="360"/>
+      </w:pPr>
+    </w:lvl>
+    <w:lvl w:ilvl="7" w:tplc="340A0019" w:tentative="1">
+      <w:start w:val="1"/>
+      <w:numFmt w:val="lowerLetter"/>
+      <w:lvlText w:val="%8."/>
+      <w:lvlJc w:val="left"/>
+      <w:pPr>
+        <w:ind w:left="5760" w:hanging="360"/>
+      </w:pPr>
+    </w:lvl>
+    <w:lvl w:ilvl="8" w:tplc="340A001B" w:tentative="1">
+      <w:start w:val="1"/>
+      <w:numFmt w:val="lowerRoman"/>
+      <w:lvlText w:val="%9."/>
+      <w:lvlJc w:val="right"/>
+      <w:pPr>
+        <w:ind w:left="6480" w:hanging="180"/>
+      </w:pPr>
+    </w:lvl>
+  </w:abstractNum>
+  <w:abstractNum w:abstractNumId="7" w15:restartNumberingAfterBreak="0">
     <w:nsid w:val="55834200"/>
     <w:multiLevelType w:val="hybridMultilevel"/>
     <w:tmpl w:val="BBF06C8C"/>
@@ -1908,7 +3625,7 @@
       </w:rPr>
     </w:lvl>
   </w:abstractNum>
-  <w:abstractNum w:abstractNumId="1" w15:restartNumberingAfterBreak="0">
+  <w:abstractNum w:abstractNumId="8" w15:restartNumberingAfterBreak="0">
     <w:nsid w:val="5938A7A6"/>
     <w:multiLevelType w:val="hybridMultilevel"/>
     <w:tmpl w:val="49E2CCE0"/>
@@ -2021,11 +3738,184 @@
       </w:rPr>
     </w:lvl>
   </w:abstractNum>
+  <w:abstractNum w:abstractNumId="9" w15:restartNumberingAfterBreak="0">
+    <w:nsid w:val="672677D4"/>
+    <w:multiLevelType w:val="multilevel"/>
+    <w:tmpl w:val="B442E97E"/>
+    <w:lvl w:ilvl="0">
+      <w:start w:val="1"/>
+      <w:numFmt w:val="bullet"/>
+      <w:lvlText w:val=""/>
+      <w:lvlJc w:val="left"/>
+      <w:pPr>
+        <w:tabs>
+          <w:tab w:val="num" w:pos="720"/>
+        </w:tabs>
+        <w:ind w:left="720" w:hanging="360"/>
+      </w:pPr>
+      <w:rPr>
+        <w:rFonts w:ascii="Symbol" w:hAnsi="Symbol" w:hint="default"/>
+        <w:sz w:val="20"/>
+      </w:rPr>
+    </w:lvl>
+    <w:lvl w:ilvl="1" w:tentative="1">
+      <w:start w:val="1"/>
+      <w:numFmt w:val="bullet"/>
+      <w:lvlText w:val="o"/>
+      <w:lvlJc w:val="left"/>
+      <w:pPr>
+        <w:tabs>
+          <w:tab w:val="num" w:pos="1440"/>
+        </w:tabs>
+        <w:ind w:left="1440" w:hanging="360"/>
+      </w:pPr>
+      <w:rPr>
+        <w:rFonts w:ascii="Courier New" w:hAnsi="Courier New" w:hint="default"/>
+        <w:sz w:val="20"/>
+      </w:rPr>
+    </w:lvl>
+    <w:lvl w:ilvl="2" w:tentative="1">
+      <w:start w:val="1"/>
+      <w:numFmt w:val="bullet"/>
+      <w:lvlText w:val=""/>
+      <w:lvlJc w:val="left"/>
+      <w:pPr>
+        <w:tabs>
+          <w:tab w:val="num" w:pos="2160"/>
+        </w:tabs>
+        <w:ind w:left="2160" w:hanging="360"/>
+      </w:pPr>
+      <w:rPr>
+        <w:rFonts w:ascii="Wingdings" w:hAnsi="Wingdings" w:hint="default"/>
+        <w:sz w:val="20"/>
+      </w:rPr>
+    </w:lvl>
+    <w:lvl w:ilvl="3" w:tentative="1">
+      <w:start w:val="1"/>
+      <w:numFmt w:val="bullet"/>
+      <w:lvlText w:val=""/>
+      <w:lvlJc w:val="left"/>
+      <w:pPr>
+        <w:tabs>
+          <w:tab w:val="num" w:pos="2880"/>
+        </w:tabs>
+        <w:ind w:left="2880" w:hanging="360"/>
+      </w:pPr>
+      <w:rPr>
+        <w:rFonts w:ascii="Wingdings" w:hAnsi="Wingdings" w:hint="default"/>
+        <w:sz w:val="20"/>
+      </w:rPr>
+    </w:lvl>
+    <w:lvl w:ilvl="4" w:tentative="1">
+      <w:start w:val="1"/>
+      <w:numFmt w:val="bullet"/>
+      <w:lvlText w:val=""/>
+      <w:lvlJc w:val="left"/>
+      <w:pPr>
+        <w:tabs>
+          <w:tab w:val="num" w:pos="3600"/>
+        </w:tabs>
+        <w:ind w:left="3600" w:hanging="360"/>
+      </w:pPr>
+      <w:rPr>
+        <w:rFonts w:ascii="Wingdings" w:hAnsi="Wingdings" w:hint="default"/>
+        <w:sz w:val="20"/>
+      </w:rPr>
+    </w:lvl>
+    <w:lvl w:ilvl="5" w:tentative="1">
+      <w:start w:val="1"/>
+      <w:numFmt w:val="bullet"/>
+      <w:lvlText w:val=""/>
+      <w:lvlJc w:val="left"/>
+      <w:pPr>
+        <w:tabs>
+          <w:tab w:val="num" w:pos="4320"/>
+        </w:tabs>
+        <w:ind w:left="4320" w:hanging="360"/>
+      </w:pPr>
+      <w:rPr>
+        <w:rFonts w:ascii="Wingdings" w:hAnsi="Wingdings" w:hint="default"/>
+        <w:sz w:val="20"/>
+      </w:rPr>
+    </w:lvl>
+    <w:lvl w:ilvl="6" w:tentative="1">
+      <w:start w:val="1"/>
+      <w:numFmt w:val="bullet"/>
+      <w:lvlText w:val=""/>
+      <w:lvlJc w:val="left"/>
+      <w:pPr>
+        <w:tabs>
+          <w:tab w:val="num" w:pos="5040"/>
+        </w:tabs>
+        <w:ind w:left="5040" w:hanging="360"/>
+      </w:pPr>
+      <w:rPr>
+        <w:rFonts w:ascii="Wingdings" w:hAnsi="Wingdings" w:hint="default"/>
+        <w:sz w:val="20"/>
+      </w:rPr>
+    </w:lvl>
+    <w:lvl w:ilvl="7" w:tentative="1">
+      <w:start w:val="1"/>
+      <w:numFmt w:val="bullet"/>
+      <w:lvlText w:val=""/>
+      <w:lvlJc w:val="left"/>
+      <w:pPr>
+        <w:tabs>
+          <w:tab w:val="num" w:pos="5760"/>
+        </w:tabs>
+        <w:ind w:left="5760" w:hanging="360"/>
+      </w:pPr>
+      <w:rPr>
+        <w:rFonts w:ascii="Wingdings" w:hAnsi="Wingdings" w:hint="default"/>
+        <w:sz w:val="20"/>
+      </w:rPr>
+    </w:lvl>
+    <w:lvl w:ilvl="8" w:tentative="1">
+      <w:start w:val="1"/>
+      <w:numFmt w:val="bullet"/>
+      <w:lvlText w:val=""/>
+      <w:lvlJc w:val="left"/>
+      <w:pPr>
+        <w:tabs>
+          <w:tab w:val="num" w:pos="6480"/>
+        </w:tabs>
+        <w:ind w:left="6480" w:hanging="360"/>
+      </w:pPr>
+      <w:rPr>
+        <w:rFonts w:ascii="Wingdings" w:hAnsi="Wingdings" w:hint="default"/>
+        <w:sz w:val="20"/>
+      </w:rPr>
+    </w:lvl>
+  </w:abstractNum>
   <w:num w:numId="1" w16cid:durableId="1822648218">
+    <w:abstractNumId w:val="7"/>
+  </w:num>
+  <w:num w:numId="2" w16cid:durableId="824975442">
+    <w:abstractNumId w:val="8"/>
+  </w:num>
+  <w:num w:numId="3" w16cid:durableId="468523457">
+    <w:abstractNumId w:val="9"/>
+  </w:num>
+  <w:num w:numId="4" w16cid:durableId="224686809">
+    <w:abstractNumId w:val="3"/>
+  </w:num>
+  <w:num w:numId="5" w16cid:durableId="1946690896">
+    <w:abstractNumId w:val="4"/>
+  </w:num>
+  <w:num w:numId="6" w16cid:durableId="304898586">
+    <w:abstractNumId w:val="2"/>
+  </w:num>
+  <w:num w:numId="7" w16cid:durableId="1230112201">
+    <w:abstractNumId w:val="5"/>
+  </w:num>
+  <w:num w:numId="8" w16cid:durableId="1111823729">
+    <w:abstractNumId w:val="1"/>
+  </w:num>
+  <w:num w:numId="9" w16cid:durableId="1351877908">
     <w:abstractNumId w:val="0"/>
   </w:num>
-  <w:num w:numId="2" w16cid:durableId="824975442">
-    <w:abstractNumId w:val="1"/>
+  <w:num w:numId="10" w16cid:durableId="765619592">
+    <w:abstractNumId w:val="6"/>
   </w:num>
 </w:numbering>
 </file>
@@ -2633,7 +4523,6 @@
   <w:style w:type="character" w:default="1" w:styleId="Fuentedeprrafopredeter">
     <w:name w:val="Default Paragraph Font"/>
     <w:uiPriority w:val="1"/>
-    <w:semiHidden/>
     <w:unhideWhenUsed/>
   </w:style>
   <w:style w:type="table" w:default="1" w:styleId="Tablanormal">
@@ -3246,23 +5135,6 @@
 </file>
 
 <file path=customXml/item1.xml><?xml version="1.0" encoding="utf-8"?>
-<p:properties xmlns:p="http://schemas.microsoft.com/office/2006/metadata/properties" xmlns:xsi="http://www.w3.org/2001/XMLSchema-instance" xmlns:pc="http://schemas.microsoft.com/office/infopath/2007/PartnerControls">
-  <documentManagement>
-    <_activity xmlns="9eda5f1d-d0fc-4cfc-81f4-de4fe8b2305b" xsi:nil="true"/>
-  </documentManagement>
-</p:properties>
-</file>
-
-<file path=customXml/item2.xml><?xml version="1.0" encoding="utf-8"?>
-<?mso-contentType ?>
-<FormTemplates xmlns="http://schemas.microsoft.com/sharepoint/v3/contenttype/forms">
-  <Display>DocumentLibraryForm</Display>
-  <Edit>DocumentLibraryForm</Edit>
-  <New>DocumentLibraryForm</New>
-</FormTemplates>
-</file>
-
-<file path=customXml/item3.xml><?xml version="1.0" encoding="utf-8"?>
 <ct:contentTypeSchema xmlns:ct="http://schemas.microsoft.com/office/2006/metadata/contentType" xmlns:ma="http://schemas.microsoft.com/office/2006/metadata/properties/metaAttributes" ct:_="" ma:_="" ma:contentTypeName="Document" ma:contentTypeID="0x0101007CDB7249B4EE4648B04CDD12D8E354D1" ma:contentTypeVersion="13" ma:contentTypeDescription="Create a new document." ma:contentTypeScope="" ma:versionID="0b64b2111f299efe1ee754bb7de58afb">
   <xsd:schema xmlns:xsd="http://www.w3.org/2001/XMLSchema" xmlns:xs="http://www.w3.org/2001/XMLSchema" xmlns:p="http://schemas.microsoft.com/office/2006/metadata/properties" xmlns:ns3="9eda5f1d-d0fc-4cfc-81f4-de4fe8b2305b" xmlns:ns4="2676a13a-d0c3-4376-9a27-1b5c9547d1e9" targetNamespace="http://schemas.microsoft.com/office/2006/metadata/properties" ma:root="true" ma:fieldsID="f74c93581018c2032268b865fb4f95d7" ns3:_="" ns4:_="">
     <xsd:import namespace="9eda5f1d-d0fc-4cfc-81f4-de4fe8b2305b"/>
@@ -3481,25 +5353,24 @@
 </ct:contentTypeSchema>
 </file>
 
-<file path=customXml/itemProps1.xml><?xml version="1.0" encoding="utf-8"?>
-<ds:datastoreItem xmlns:ds="http://schemas.openxmlformats.org/officeDocument/2006/customXml" ds:itemID="{F70997EC-8824-48F5-99FA-A6BB806ECEEC}">
-  <ds:schemaRefs>
-    <ds:schemaRef ds:uri="http://schemas.microsoft.com/office/2006/metadata/properties"/>
-    <ds:schemaRef ds:uri="http://schemas.microsoft.com/office/infopath/2007/PartnerControls"/>
-    <ds:schemaRef ds:uri="9eda5f1d-d0fc-4cfc-81f4-de4fe8b2305b"/>
-  </ds:schemaRefs>
-</ds:datastoreItem>
+<file path=customXml/item2.xml><?xml version="1.0" encoding="utf-8"?>
+<?mso-contentType ?>
+<FormTemplates xmlns="http://schemas.microsoft.com/sharepoint/v3/contenttype/forms">
+  <Display>DocumentLibraryForm</Display>
+  <Edit>DocumentLibraryForm</Edit>
+  <New>DocumentLibraryForm</New>
+</FormTemplates>
 </file>
 
-<file path=customXml/itemProps2.xml><?xml version="1.0" encoding="utf-8"?>
-<ds:datastoreItem xmlns:ds="http://schemas.openxmlformats.org/officeDocument/2006/customXml" ds:itemID="{7D73E285-4EB5-4DD3-9203-316B51A37EB7}">
-  <ds:schemaRefs>
-    <ds:schemaRef ds:uri="http://schemas.microsoft.com/sharepoint/v3/contenttype/forms"/>
-  </ds:schemaRefs>
-</ds:datastoreItem>
+<file path=customXml/item3.xml><?xml version="1.0" encoding="utf-8"?>
+<p:properties xmlns:p="http://schemas.microsoft.com/office/2006/metadata/properties" xmlns:xsi="http://www.w3.org/2001/XMLSchema-instance" xmlns:pc="http://schemas.microsoft.com/office/infopath/2007/PartnerControls">
+  <documentManagement>
+    <_activity xmlns="9eda5f1d-d0fc-4cfc-81f4-de4fe8b2305b" xsi:nil="true"/>
+  </documentManagement>
+</p:properties>
 </file>
 
-<file path=customXml/itemProps3.xml><?xml version="1.0" encoding="utf-8"?>
+<file path=customXml/itemProps1.xml><?xml version="1.0" encoding="utf-8"?>
 <ds:datastoreItem xmlns:ds="http://schemas.openxmlformats.org/officeDocument/2006/customXml" ds:itemID="{2EACB14D-FE3C-4EA8-B7E5-D02008FA697A}">
   <ds:schemaRefs>
     <ds:schemaRef ds:uri="http://schemas.microsoft.com/office/2006/metadata/contentType"/>
@@ -3516,4 +5387,22 @@
     <ds:schemaRef ds:uri="http://schemas.microsoft.com/internal/obd"/>
   </ds:schemaRefs>
 </ds:datastoreItem>
+</file>
+
+<file path=customXml/itemProps2.xml><?xml version="1.0" encoding="utf-8"?>
+<ds:datastoreItem xmlns:ds="http://schemas.openxmlformats.org/officeDocument/2006/customXml" ds:itemID="{7D73E285-4EB5-4DD3-9203-316B51A37EB7}">
+  <ds:schemaRefs>
+    <ds:schemaRef ds:uri="http://schemas.microsoft.com/sharepoint/v3/contenttype/forms"/>
+  </ds:schemaRefs>
+</ds:datastoreItem>
+</file>
+
+<file path=customXml/itemProps3.xml><?xml version="1.0" encoding="utf-8"?>
+<ds:datastoreItem xmlns:ds="http://schemas.openxmlformats.org/officeDocument/2006/customXml" ds:itemID="{F70997EC-8824-48F5-99FA-A6BB806ECEEC}">
+  <ds:schemaRefs>
+    <ds:schemaRef ds:uri="http://schemas.microsoft.com/office/2006/metadata/properties"/>
+    <ds:schemaRef ds:uri="http://schemas.microsoft.com/office/infopath/2007/PartnerControls"/>
+    <ds:schemaRef ds:uri="9eda5f1d-d0fc-4cfc-81f4-de4fe8b2305b"/>
+  </ds:schemaRefs>
+</ds:datastoreItem>
 </file>
</xml_diff>